<commit_message>
Clarify interpretation and update report exports
State cost relationships, screening definitions and benchmark comparisons directly. Update article and short report exports; analytical data and reference results are unchanged.
</commit_message>
<xml_diff>
--- a/reports/manuscript.docx
+++ b/reports/manuscript.docx
@@ -505,35 +505,7 @@
           <w:i w:val="0"/>
           <w:color w:val="000000"/>
         </w:rPr>
-        <w:t xml:space="preserve">The ratio represents kilograms of urea at the quoted monetary value of one kilogram of maize. For fixed fertilizer quantity </w:t>
-      </w:r>
-      <m:oMath>
-        <m:r>
-          <m:t xml:space="preserve">u</m:t>
-        </m:r>
-      </m:oMath>
-      <w:r>
-        <w:rPr>
-          <w:rFonts w:ascii="Liberation Serif" w:hAnsi="Liberation Serif" w:eastAsia="Liberation Serif"/>
-          <w:b w:val="0"/>
-          <w:i w:val="0"/>
-          <w:color w:val="000000"/>
-        </w:rPr>
-        <w:t xml:space="preserve"> and maize output sold </w:t>
-      </w:r>
-      <m:oMath>
-        <m:r>
-          <m:t xml:space="preserve">Y</m:t>
-        </m:r>
-      </m:oMath>
-      <w:r>
-        <w:rPr>
-          <w:rFonts w:ascii="Liberation Serif" w:hAnsi="Liberation Serif" w:eastAsia="Liberation Serif"/>
-          <w:b w:val="0"/>
-          <w:i w:val="0"/>
-          <w:color w:val="000000"/>
-        </w:rPr>
-        <w:t xml:space="preserve">, fertilizer expense divided by maize revenue is </w:t>
+        <w:t xml:space="preserve">The ratio represents kilograms of urea at the quoted monetary value of one kilogram of maize. Fertilizer expense as a share of maize revenue equals </w:t>
       </w:r>
       <m:oMath>
         <m:r>
@@ -565,7 +537,35 @@
           <w:i w:val="0"/>
           <w:color w:val="000000"/>
         </w:rPr>
-        <w:t>. Fertilizer profitability combines yield response with output and input prices (Ragasa et al., 2025); Northeast Chinese spring-maize recommendations use soil-fertility groups and response functions (Bao et al., 2020). The exchange ratio measures the quoted relative-price component of this relationship.</w:t>
+        <w:t xml:space="preserve">, where </w:t>
+      </w:r>
+      <m:oMath>
+        <m:r>
+          <m:t xml:space="preserve">u</m:t>
+        </m:r>
+      </m:oMath>
+      <w:r>
+        <w:rPr>
+          <w:rFonts w:ascii="Liberation Serif" w:hAnsi="Liberation Serif" w:eastAsia="Liberation Serif"/>
+          <w:b w:val="0"/>
+          <w:i w:val="0"/>
+          <w:color w:val="000000"/>
+        </w:rPr>
+        <w:t xml:space="preserve"> is fertilizer quantity and </w:t>
+      </w:r>
+      <m:oMath>
+        <m:r>
+          <m:t xml:space="preserve">Y</m:t>
+        </m:r>
+      </m:oMath>
+      <w:r>
+        <w:rPr>
+          <w:rFonts w:ascii="Liberation Serif" w:hAnsi="Liberation Serif" w:eastAsia="Liberation Serif"/>
+          <w:b w:val="0"/>
+          <w:i w:val="0"/>
+          <w:color w:val="000000"/>
+        </w:rPr>
+        <w:t xml:space="preserve"> is maize output sold. Fertilizer profitability combines yield response with output and input prices (Ragasa et al., 2025); Northeast Chinese spring-maize recommendations use soil-fertility groups and response functions (Bao et al., 2020). The exchange ratio measures the quoted relative-price component of this relationship.</w:t>
       </w:r>
     </w:p>
     <w:p>
@@ -579,7 +579,7 @@
           <w:i w:val="0"/>
           <w:color w:val="000000"/>
         </w:rPr>
-        <w:t xml:space="preserve">During a constant-urea segment, </w:t>
+        <w:t xml:space="preserve">An unchanged urea quotation gives </w:t>
       </w:r>
       <m:oMath>
         <m:r>
@@ -641,7 +641,7 @@
           <w:i w:val="0"/>
           <w:color w:val="000000"/>
         </w:rPr>
-        <w:t>. The maize quotation supplies all recorded numerical movement in the ratio within that segment, while the unchanged urea level continues to determine its level. When that value also occupies part of the historical window, quotation persistence influences both the benchmark and the later comparison. Examining the two product histories therefore explains which observed adjustments underlie an index change.</w:t>
+        <w:t>: maize supplies the recorded movement in the exchange ratio, and the repeated urea quotation sets its level. Repeated urea values within the historical window also enter the benchmark. The product histories therefore link changes in the exchange ratio to both current price adjustments and the historical comparison level.</w:t>
       </w:r>
     </w:p>
     <w:p>
@@ -1803,7 +1803,7 @@
                 <w:color w:val="000000"/>
                 <w:sz w:val="19"/>
               </w:rPr>
-              <w:t>Low-update branch only</w:t>
+              <w:t>Group defined by the low-update branch</w:t>
             </w:r>
           </w:p>
         </w:tc>
@@ -1892,7 +1892,7 @@
                 <w:color w:val="000000"/>
                 <w:sz w:val="19"/>
               </w:rPr>
-              <w:t>Retained by the complete low-update OR run-amplitude screen</w:t>
+              <w:t>Counties passing the combined low-update or run-amplitude screen</w:t>
             </w:r>
           </w:p>
         </w:tc>
@@ -1981,7 +1981,7 @@
                 <w:color w:val="000000"/>
                 <w:sz w:val="19"/>
               </w:rPr>
-              <w:t>2,481 valid county-period pairs; distinct from aggregate-complete dates</w:t>
+              <w:t>2,481 valid county-period pairs, including dates with an incomplete aggregate</w:t>
             </w:r>
           </w:p>
         </w:tc>
@@ -2057,7 +2057,7 @@
           <w:i w:val="0"/>
           <w:color w:val="000000"/>
         </w:rPr>
-        <w:t>We use the national series to identify wider market movement during an unchanged county quotation run. The screen measures proportional national price movement during each unchanged county quotation run. With partial national coverage, the observed maximum-to-minimum range is a lower bound on the full national range over that window. An observed national amplitude above 20% records substantial movement in the matched national series while the county quotation stays fixed.</w:t>
+        <w:t>We use proportional national price movement to compare unchanged county quotations with the wider market. An observed national amplitude above 20% records substantial movement in the matched national series while the county quotation stays fixed. The maximum-to-minimum range across observed national prices is a lower bound on the full range over the run when national coverage is partial.</w:t>
       </w:r>
     </w:p>
     <w:p>
@@ -2665,7 +2665,7 @@
           <w:i w:val="0"/>
           <w:color w:val="000000"/>
         </w:rPr>
-        <w:t xml:space="preserve"> across valid observations and have units of log-point monitoring periods. Attainment on an individual date defines the aggregate condition used here; the alert rule in Section 4.5 adds the requirement of three consecutive qualifying observations.</w:t>
+        <w:t xml:space="preserve"> across valid observations and have units of log-point monitoring periods. We classify aggregate attainment date by date; the alert rule in Section 4.5 starts after three consecutive qualifying observations.</w:t>
       </w:r>
     </w:p>
     <w:p>
@@ -3512,7 +3512,7 @@
           <w:i w:val="0"/>
           <w:color w:val="000000"/>
         </w:rPr>
-        <w:t>With partial national coverage, an observed range above the amplitude threshold confirms the run-amplitude branch; a lower observed range with unobserved periods leaves it unresolved. The two branches combine through a logical OR, so a low-update flag confirms the classification independently of national coverage. The threshold grid combines update-rate fractions of one-quarter, one-third, one-half and two-thirds; minimum run lengths strictly above 24, 36 and 48 observations; and national-amplitude thresholds strictly above 10%, 20% and 30%. These choices give 36 settings. We apply each setting to all twelve counties and recalculate the comparisons for each resulting county group.</w:t>
+        <w:t>An observed national range exceeding the amplitude threshold flags the run-amplitude branch even with partial coverage. Lower observed ranges with unobserved periods receive an unresolved classification. Either screening branch flags a county, so the low-update branch classifies counties independently of national coverage. The threshold grid combines update-rate fractions of one-quarter, one-third, one-half and two-thirds; minimum run lengths strictly above 24, 36 and 48 observations; and national-amplitude thresholds strictly above 10%, 20% and 30%. These choices give 36 settings. We apply each setting to all twelve counties and recalculate the comparisons for each resulting county group.</w:t>
       </w:r>
     </w:p>
     <w:p>
@@ -3582,7 +3582,7 @@
           <w:i w:val="0"/>
           <w:color w:val="000000"/>
         </w:rPr>
-        <w:t xml:space="preserve">Rule i triggers from the third consecutive complete scheduled date with </w:t>
+        <w:t xml:space="preserve">Rule i starts on the third consecutive complete scheduled date with </w:t>
       </w:r>
       <m:oMath>
         <m:sSub>
@@ -3611,7 +3611,7 @@
           <w:i w:val="0"/>
           <w:color w:val="000000"/>
         </w:rPr>
-        <w:t xml:space="preserve">, then continues while that condition holds. Alert dates begin with the third qualifying observation. Rule ii triggers on </w:t>
+        <w:t xml:space="preserve"> and covers subsequent consecutive below-benchmark dates. Rule ii triggers on </w:t>
       </w:r>
       <m:oMath>
         <m:r>
@@ -3712,7 +3712,7 @@
           <w:i w:val="0"/>
           <w:color w:val="000000"/>
         </w:rPr>
-        <w:t>Missing scheduled observations reset the aggregate streak and end an active episode. Any false or missing date ends a trigger episode; episodes continue across a source boundary while the trigger condition holds. Trigger fractions use 204 complete dates, and the date-level records preserve all 207 slots.</w:t>
+        <w:t>Missing scheduled observations reset the aggregate streak. A non-triggering or missing date ends an episode; consecutive triggering dates form an episode across source boundaries. Trigger fractions use 204 complete dates, and the date-level records include all 207 slots.</w:t>
       </w:r>
     </w:p>
     <w:p>
@@ -5460,7 +5460,7 @@
           <w:i w:val="0"/>
           <w:color w:val="000000"/>
         </w:rPr>
-        <w:t>Benchmark choice shifts aggregate attainment for all twelve counties between 34.31% (70 of 204 dates) under 2020 and 99.02% (202 of 204 dates) under 2018–2019 (Table 3; Figure 1). Conditional mean H ranges from 11.18% to 24.40%. The result under the three-year benchmark is 17.05%, compared with a fixed-reference mean of 13.38%. Its paired interval is [0.20, 5.12] percentage points. The original twelve-county group’s paired interval is strictly positive under each of the five benchmarks.</w:t>
+        <w:t>Benchmark choice shifts aggregate attainment for all twelve counties between 34.31% (70 of 204 dates) under 2020 and 99.02% (202 of 204 dates) under 2018–2019 (Table 3; Figure 1). Among aggregate-attainment dates, mean county incidence H ranges from 11.18% to 24.40%. The result under the three-year benchmark is 17.05%, compared with a fixed-reference mean of 13.38%. Its paired interval is [0.20, 5.12] percentage points. The original twelve-county group’s paired interval is strictly positive under each of the five benchmarks.</w:t>
       </w:r>
     </w:p>
     <w:p>
@@ -9751,7 +9751,7 @@
           <w:color w:val="000000"/>
           <w:sz w:val="19"/>
         </w:rPr>
-        <w:t>Figure 1. Benchmark dependence for all twelve counties, ten counties excluding Jianping and Qingyuan, and the six screened counties. Panels show aggregate attainment on the same 204 complete dates, conditional mean H and the fixed-reference 90% interval, the fixed-reference tail estimate with Monte Carlo uncertainty, and paired mean D with its 95% interval. Benchmarks are categorical; points are grouped by county membership. All panels use six-period blocks and 1,999 draws. H is a percent; D is in percentage points. Source: the five-benchmark comparisons summarized in Table 3.</w:t>
+        <w:t>Figure 1. Benchmark dependence for all twelve counties, ten counties excluding Jianping and Qingyuan, and the six screened counties. Panels show aggregate attainment on the same 204 complete dates, mean county incidence H on aggregate-attainment dates and the fixed-reference 90% interval, the fixed-reference tail estimate with Monte Carlo uncertainty, and paired mean D with its 95% interval. Benchmarks are categorical; points are grouped by county membership. All panels use six-period blocks and 1,999 draws. H is a percent; D is in percentage points. Source: the five-benchmark comparisons summarized in Table 3.</w:t>
       </w:r>
     </w:p>
     <w:p>
@@ -14331,7 +14331,59 @@
           <w:i w:val="0"/>
           <w:color w:val="000000"/>
         </w:rPr>
-        <w:t>We measure the quoted exchange terms between maize and urea in the twelve-county archive. At fixed fertilizer quantity and maize sales, a lower exchange ratio raises the fertilizer-expense share of maize revenue. The screen identifies county–product records for checking against sampling-enterprise, transaction-date and observation-status information. The inventory covers 31 exact product/specification/unit groups, with capture coverage recorded for each group and matched national comparisons for maize purchase and domestic urea. We compare proportional movement within each series to accommodate differences in product specifications and survey scope. Under partial coverage, the observed national amplitude provides a lower bound on the amplitude over the full matched window.</w:t>
+        <w:t xml:space="preserve">We measure the quoted exchange terms between maize and urea in the twelve-county archive. Fertilizer expense as a share of maize revenue equals </w:t>
+      </w:r>
+      <m:oMath>
+        <m:r>
+          <m:t xml:space="preserve">(</m:t>
+        </m:r>
+        <m:r>
+          <m:t xml:space="preserve">u</m:t>
+        </m:r>
+        <m:r>
+          <m:t xml:space="preserve">/</m:t>
+        </m:r>
+        <m:r>
+          <m:t xml:space="preserve">Y</m:t>
+        </m:r>
+        <m:r>
+          <m:t xml:space="preserve">)</m:t>
+        </m:r>
+        <m:r>
+          <m:t xml:space="preserve">/</m:t>
+        </m:r>
+        <m:r>
+          <m:t xml:space="preserve">Q</m:t>
+        </m:r>
+      </m:oMath>
+      <w:r>
+        <w:rPr>
+          <w:rFonts w:ascii="Liberation Serif" w:hAnsi="Liberation Serif" w:eastAsia="Liberation Serif"/>
+          <w:b w:val="0"/>
+          <w:i w:val="0"/>
+          <w:color w:val="000000"/>
+        </w:rPr>
+        <w:t xml:space="preserve">; a lower exchange ratio raises this share for a given fertilizer-to-output ratio </w:t>
+      </w:r>
+      <m:oMath>
+        <m:r>
+          <m:t xml:space="preserve">u</m:t>
+        </m:r>
+        <m:r>
+          <m:t xml:space="preserve">/</m:t>
+        </m:r>
+        <m:r>
+          <m:t xml:space="preserve">Y</m:t>
+        </m:r>
+      </m:oMath>
+      <w:r>
+        <w:rPr>
+          <w:rFonts w:ascii="Liberation Serif" w:hAnsi="Liberation Serif" w:eastAsia="Liberation Serif"/>
+          <w:b w:val="0"/>
+          <w:i w:val="0"/>
+          <w:color w:val="000000"/>
+        </w:rPr>
+        <w:t>. The screen identifies county–product records for checking against sampling-enterprise, transaction-date and observation-status information. The inventory covers 31 exact product/specification/unit groups, with capture coverage recorded for each group and matched national comparisons for maize purchase and domestic urea. We compare proportional movement within each series to accommodate differences in product specifications and survey scope. Under partial coverage, the observed national amplitude provides a lower bound on the amplitude over the full matched window.</w:t>
       </w:r>
     </w:p>
     <w:p>

</xml_diff>